<commit_message>
Update files with user information and test conditions
</commit_message>
<xml_diff>
--- a/tests/GoldTeam_BetaTest_#1.docx
+++ b/tests/GoldTeam_BetaTest_#1.docx
@@ -96,10 +96,23 @@
         </w:rPr>
         <w:t>eedback</w:t>
       </w:r>
+      <w:r>
+        <w:rPr>
+          <w:b/>
+          <w:bCs/>
+        </w:rPr>
+        <w:t>: Melvin Matthews Jr</w:t>
+      </w:r>
     </w:p>
     <w:p/>
     <w:p/>
     <w:p>
+      <w:r>
+        <w:t>The user did it on his computer as if he were in real conditions. He was asked to be a customer looking to take a vacation in Washington state, make a reservation on our website, and send a contact message. He was then asked five questions about his experience on the website.</w:t>
+      </w:r>
+    </w:p>
+    <w:p/>
+    <w:p>
       <w:pPr>
         <w:rPr>
           <w:b/>
@@ -117,10 +130,7 @@
     <w:p/>
     <w:p>
       <w:r>
-        <w:t xml:space="preserve">The design is appealing, but dated. The colors are fine, but the font is generic. I found it inconsistent from one page to another. For example, the “ About Us " page looks more visually appealing than the “Attractions” page. </w:t>
-      </w:r>
-      <w:r>
-        <w:t>The link in the header should be "About Us" and not just “about”</w:t>
+        <w:t>The design is appealing, but dated. The colors are fine, but the font is generic. I found it inconsistent from one page to another. For example, the “ About Us " page looks more visually appealing than the “Attractions” page. The link in the header should be "About Us" and not just “about”</w:t>
       </w:r>
       <w:r>
         <w:t xml:space="preserve">. </w:t>
@@ -251,7 +261,11 @@
         <w:t>ontact message was easily accessible</w:t>
       </w:r>
       <w:r>
-        <w:t xml:space="preserve">. I had no issue writing and sending a message. The example of a phone number causes some confusion because it includes dashes, and the form doesn’t accept them when entering the number. Happy to </w:t>
+        <w:t xml:space="preserve">. I had no issue writing and sending a message. The example of a phone number causes some confusion because it includes dashes, and the form doesn’t </w:t>
+      </w:r>
+      <w:r>
+        <w:lastRenderedPageBreak/>
+        <w:t xml:space="preserve">accept them when entering the number. Happy to </w:t>
       </w:r>
       <w:r>
         <w:t>have a link</w:t>

</xml_diff>